<commit_message>
Update whack-a-mole spreadsheet source and prevent rank text line break
</commit_message>
<xml_diff>
--- a/書法題庫.docx
+++ b/書法題庫.docx
@@ -51,16 +51,8 @@
         <w:rPr>
           <w:rFonts w:hint="eastAsia"/>
         </w:rPr>
-        <w:t>蘭</w:t>
-      </w:r>
-      <w:proofErr w:type="gramStart"/>
-      <w:r>
-        <w:rPr>
-          <w:rFonts w:hint="eastAsia"/>
-        </w:rPr>
-        <w:t>亭集序</w:t>
-      </w:r>
-      <w:proofErr w:type="gramEnd"/>
+        <w:t>蘭亭集序</w:t>
+      </w:r>
       <w:r>
         <w:rPr>
           <w:rFonts w:hint="eastAsia"/>
@@ -668,17 +660,8 @@
           <w:rFonts w:ascii="新細明體" w:cs="Arial"/>
           <w:szCs w:val="25"/>
         </w:rPr>
-        <w:t>多用直線、</w:t>
-      </w:r>
-      <w:proofErr w:type="gramStart"/>
-      <w:r>
-        <w:rPr>
-          <w:rFonts w:ascii="新細明體" w:cs="Arial"/>
-          <w:szCs w:val="25"/>
-        </w:rPr>
-        <w:t>方筆且</w:t>
-      </w:r>
-      <w:proofErr w:type="gramEnd"/>
+        <w:t>多用直線、方筆且</w:t>
+      </w:r>
       <w:r>
         <w:rPr>
           <w:rFonts w:ascii="新細明體" w:cs="Arial" w:hint="eastAsia"/>
@@ -887,9 +870,6 @@
           <w:numId w:val="1"/>
         </w:numPr>
         <w:ind w:leftChars="0"/>
-        <w:rPr>
-          <w:rFonts w:hint="eastAsia"/>
-        </w:rPr>
       </w:pPr>
       <w:r>
         <w:rPr>
@@ -944,6 +924,43 @@
           <w:rFonts w:hint="eastAsia"/>
         </w:rPr>
         <w:t>四書集注</w:t>
+      </w:r>
+    </w:p>
+    <w:p>
+      <w:pPr>
+        <w:rPr>
+          <w:rFonts w:hint="eastAsia"/>
+        </w:rPr>
+      </w:pPr>
+      <w:r>
+        <w:rPr>
+          <w:rFonts w:hint="eastAsia"/>
+        </w:rPr>
+        <w:t xml:space="preserve">   </w:t>
+      </w:r>
+      <w:r>
+        <w:rPr>
+          <w:rFonts w:hint="eastAsia"/>
+        </w:rPr>
+        <w:t>正確答案</w:t>
+      </w:r>
+      <w:r>
+        <w:rPr>
+          <w:rFonts w:hint="eastAsia"/>
+        </w:rPr>
+        <w:t>: (</w:t>
+      </w:r>
+      <w:r>
+        <w:rPr>
+          <w:rFonts w:hint="eastAsia"/>
+        </w:rPr>
+        <w:t>A</w:t>
+      </w:r>
+      <w:r>
+        <w:rPr>
+          <w:rFonts w:hint="eastAsia"/>
+        </w:rPr>
+        <w:t>)</w:t>
       </w:r>
       <w:bookmarkStart w:id="0" w:name="_GoBack"/>
       <w:bookmarkEnd w:id="0"/>
@@ -956,6 +973,44 @@
     </w:sectPr>
   </w:body>
 </w:document>
+</file>
+
+<file path=word/endnotes.xml><?xml version="1.0" encoding="utf-8"?>
+<w:endnotes xmlns:wpc="http://schemas.microsoft.com/office/word/2010/wordprocessingCanvas" xmlns:cx="http://schemas.microsoft.com/office/drawing/2014/chartex" xmlns:mc="http://schemas.openxmlformats.org/markup-compatibility/2006" xmlns:o="urn:schemas-microsoft-com:office:office" xmlns:r="http://schemas.openxmlformats.org/officeDocument/2006/relationships" xmlns:m="http://schemas.openxmlformats.org/officeDocument/2006/math" xmlns:v="urn:schemas-microsoft-com:vml" xmlns:wp14="http://schemas.microsoft.com/office/word/2010/wordprocessingDrawing" xmlns:wp="http://schemas.openxmlformats.org/drawingml/2006/wordprocessingDrawing" xmlns:w10="urn:schemas-microsoft-com:office:word" xmlns:w="http://schemas.openxmlformats.org/wordprocessingml/2006/main" xmlns:w14="http://schemas.microsoft.com/office/word/2010/wordml" xmlns:w15="http://schemas.microsoft.com/office/word/2012/wordml" xmlns:w16se="http://schemas.microsoft.com/office/word/2015/wordml/symex" xmlns:wpg="http://schemas.microsoft.com/office/word/2010/wordprocessingGroup" xmlns:wpi="http://schemas.microsoft.com/office/word/2010/wordprocessingInk" xmlns:wne="http://schemas.microsoft.com/office/word/2006/wordml" xmlns:wps="http://schemas.microsoft.com/office/word/2010/wordprocessingShape" mc:Ignorable="w14 w15 w16se wp14">
+  <w:endnote w:type="separator" w:id="-1">
+    <w:p>
+      <w:r>
+        <w:separator/>
+      </w:r>
+    </w:p>
+  </w:endnote>
+  <w:endnote w:type="continuationSeparator" w:id="0">
+    <w:p>
+      <w:r>
+        <w:continuationSeparator/>
+      </w:r>
+    </w:p>
+  </w:endnote>
+</w:endnotes>
+</file>
+
+<file path=word/footnotes.xml><?xml version="1.0" encoding="utf-8"?>
+<w:footnotes xmlns:wpc="http://schemas.microsoft.com/office/word/2010/wordprocessingCanvas" xmlns:cx="http://schemas.microsoft.com/office/drawing/2014/chartex" xmlns:mc="http://schemas.openxmlformats.org/markup-compatibility/2006" xmlns:o="urn:schemas-microsoft-com:office:office" xmlns:r="http://schemas.openxmlformats.org/officeDocument/2006/relationships" xmlns:m="http://schemas.openxmlformats.org/officeDocument/2006/math" xmlns:v="urn:schemas-microsoft-com:vml" xmlns:wp14="http://schemas.microsoft.com/office/word/2010/wordprocessingDrawing" xmlns:wp="http://schemas.openxmlformats.org/drawingml/2006/wordprocessingDrawing" xmlns:w10="urn:schemas-microsoft-com:office:word" xmlns:w="http://schemas.openxmlformats.org/wordprocessingml/2006/main" xmlns:w14="http://schemas.microsoft.com/office/word/2010/wordml" xmlns:w15="http://schemas.microsoft.com/office/word/2012/wordml" xmlns:w16se="http://schemas.microsoft.com/office/word/2015/wordml/symex" xmlns:wpg="http://schemas.microsoft.com/office/word/2010/wordprocessingGroup" xmlns:wpi="http://schemas.microsoft.com/office/word/2010/wordprocessingInk" xmlns:wne="http://schemas.microsoft.com/office/word/2006/wordml" xmlns:wps="http://schemas.microsoft.com/office/word/2010/wordprocessingShape" mc:Ignorable="w14 w15 w16se wp14">
+  <w:footnote w:type="separator" w:id="-1">
+    <w:p>
+      <w:r>
+        <w:separator/>
+      </w:r>
+    </w:p>
+  </w:footnote>
+  <w:footnote w:type="continuationSeparator" w:id="0">
+    <w:p>
+      <w:r>
+        <w:continuationSeparator/>
+      </w:r>
+    </w:p>
+  </w:footnote>
+</w:footnotes>
 </file>
 
 <file path=word/numbering.xml><?xml version="1.0" encoding="utf-8"?>
@@ -1486,6 +1541,66 @@
       <w:ind w:leftChars="200" w:left="480"/>
     </w:pPr>
   </w:style>
+  <w:style w:type="paragraph" w:styleId="a4">
+    <w:name w:val="header"/>
+    <w:basedOn w:val="a"/>
+    <w:link w:val="a5"/>
+    <w:uiPriority w:val="99"/>
+    <w:unhideWhenUsed/>
+    <w:rsid w:val="005B7220"/>
+    <w:pPr>
+      <w:tabs>
+        <w:tab w:val="center" w:pos="4153"/>
+        <w:tab w:val="right" w:pos="8306"/>
+      </w:tabs>
+      <w:snapToGrid w:val="0"/>
+    </w:pPr>
+    <w:rPr>
+      <w:sz w:val="20"/>
+      <w:szCs w:val="20"/>
+    </w:rPr>
+  </w:style>
+  <w:style w:type="character" w:customStyle="1" w:styleId="a5">
+    <w:name w:val="頁首 字元"/>
+    <w:basedOn w:val="a0"/>
+    <w:link w:val="a4"/>
+    <w:uiPriority w:val="99"/>
+    <w:rsid w:val="005B7220"/>
+    <w:rPr>
+      <w:sz w:val="20"/>
+      <w:szCs w:val="20"/>
+    </w:rPr>
+  </w:style>
+  <w:style w:type="paragraph" w:styleId="a6">
+    <w:name w:val="footer"/>
+    <w:basedOn w:val="a"/>
+    <w:link w:val="a7"/>
+    <w:uiPriority w:val="99"/>
+    <w:unhideWhenUsed/>
+    <w:rsid w:val="005B7220"/>
+    <w:pPr>
+      <w:tabs>
+        <w:tab w:val="center" w:pos="4153"/>
+        <w:tab w:val="right" w:pos="8306"/>
+      </w:tabs>
+      <w:snapToGrid w:val="0"/>
+    </w:pPr>
+    <w:rPr>
+      <w:sz w:val="20"/>
+      <w:szCs w:val="20"/>
+    </w:rPr>
+  </w:style>
+  <w:style w:type="character" w:customStyle="1" w:styleId="a7">
+    <w:name w:val="頁尾 字元"/>
+    <w:basedOn w:val="a0"/>
+    <w:link w:val="a6"/>
+    <w:uiPriority w:val="99"/>
+    <w:rsid w:val="005B7220"/>
+    <w:rPr>
+      <w:sz w:val="20"/>
+      <w:szCs w:val="20"/>
+    </w:rPr>
+  </w:style>
 </w:styles>
 </file>
 

</xml_diff>